<commit_message>
major updates to make it a method-first paper'
</commit_message>
<xml_diff>
--- a/manuscript/figures/supplementary/Supplementary_figures.docx
+++ b/manuscript/figures/supplementary/Supplementary_figures.docx
@@ -11,10 +11,10 @@
           <w:noProof/>
         </w:rPr>
         <w:drawing>
-          <wp:inline distT="0" distB="0" distL="0" distR="0" wp14:anchorId="6EF299F6" wp14:editId="1CC468E1">
+          <wp:inline distT="0" distB="0" distL="0" distR="0" wp14:anchorId="28F7DF92" wp14:editId="0445C831">
             <wp:extent cx="5943600" cy="5094605"/>
             <wp:effectExtent l="0" t="0" r="0" b="0"/>
-            <wp:docPr id="589035840" name="Picture 1"/>
+            <wp:docPr id="55837696" name="Picture 2"/>
             <wp:cNvGraphicFramePr>
               <a:graphicFrameLocks xmlns:a="http://schemas.openxmlformats.org/drawingml/2006/main" noChangeAspect="1"/>
             </wp:cNvGraphicFramePr>
@@ -22,7 +22,7 @@
               <a:graphicData uri="http://schemas.openxmlformats.org/drawingml/2006/picture">
                 <pic:pic xmlns:pic="http://schemas.openxmlformats.org/drawingml/2006/picture">
                   <pic:nvPicPr>
-                    <pic:cNvPr id="589035840" name="Picture 589035840"/>
+                    <pic:cNvPr id="55837696" name="Picture 55837696"/>
                     <pic:cNvPicPr/>
                   </pic:nvPicPr>
                   <pic:blipFill>
@@ -82,10 +82,10 @@
         </w:rPr>
         <w:lastRenderedPageBreak/>
         <w:drawing>
-          <wp:inline distT="0" distB="0" distL="0" distR="0" wp14:anchorId="547143F5" wp14:editId="5E812DBC">
+          <wp:inline distT="0" distB="0" distL="0" distR="0" wp14:anchorId="3641950B" wp14:editId="2513D101">
             <wp:extent cx="5943600" cy="5094605"/>
             <wp:effectExtent l="0" t="0" r="0" b="0"/>
-            <wp:docPr id="1359037854" name="Picture 2"/>
+            <wp:docPr id="1985508965" name="Picture 3"/>
             <wp:cNvGraphicFramePr>
               <a:graphicFrameLocks xmlns:a="http://schemas.openxmlformats.org/drawingml/2006/main" noChangeAspect="1"/>
             </wp:cNvGraphicFramePr>
@@ -93,7 +93,7 @@
               <a:graphicData uri="http://schemas.openxmlformats.org/drawingml/2006/picture">
                 <pic:pic xmlns:pic="http://schemas.openxmlformats.org/drawingml/2006/picture">
                   <pic:nvPicPr>
-                    <pic:cNvPr id="1359037854" name="Picture 1359037854"/>
+                    <pic:cNvPr id="1985508965" name="Picture 1985508965"/>
                     <pic:cNvPicPr/>
                   </pic:nvPicPr>
                   <pic:blipFill>
@@ -153,10 +153,10 @@
         </w:rPr>
         <w:lastRenderedPageBreak/>
         <w:drawing>
-          <wp:inline distT="0" distB="0" distL="0" distR="0" wp14:anchorId="65D69587" wp14:editId="4A2DEA45">
+          <wp:inline distT="0" distB="0" distL="0" distR="0" wp14:anchorId="2DA27528" wp14:editId="70B684DC">
             <wp:extent cx="5943600" cy="5094605"/>
             <wp:effectExtent l="0" t="0" r="0" b="0"/>
-            <wp:docPr id="802654637" name="Picture 3"/>
+            <wp:docPr id="1913824035" name="Picture 4"/>
             <wp:cNvGraphicFramePr>
               <a:graphicFrameLocks xmlns:a="http://schemas.openxmlformats.org/drawingml/2006/main" noChangeAspect="1"/>
             </wp:cNvGraphicFramePr>
@@ -164,7 +164,7 @@
               <a:graphicData uri="http://schemas.openxmlformats.org/drawingml/2006/picture">
                 <pic:pic xmlns:pic="http://schemas.openxmlformats.org/drawingml/2006/picture">
                   <pic:nvPicPr>
-                    <pic:cNvPr id="802654637" name="Picture 802654637"/>
+                    <pic:cNvPr id="1913824035" name="Picture 1913824035"/>
                     <pic:cNvPicPr/>
                   </pic:nvPicPr>
                   <pic:blipFill>
@@ -213,6 +213,9 @@
       <w:r>
         <w:t>. Profile composition per canton</w:t>
       </w:r>
+      <w:r>
+        <w:t xml:space="preserve">. Only respondents who indicated to work in Switzerland are represented. </w:t>
+      </w:r>
     </w:p>
     <w:p>
       <w:pPr>
@@ -224,10 +227,10 @@
         </w:rPr>
         <w:lastRenderedPageBreak/>
         <w:drawing>
-          <wp:inline distT="0" distB="0" distL="0" distR="0" wp14:anchorId="7289E881" wp14:editId="3F0F549D">
-            <wp:extent cx="4486014" cy="7850221"/>
-            <wp:effectExtent l="0" t="0" r="0" b="0"/>
-            <wp:docPr id="660850121" name="Picture 4"/>
+          <wp:inline distT="0" distB="0" distL="0" distR="0" wp14:anchorId="1CFC98AD" wp14:editId="75D7BE90">
+            <wp:extent cx="4519367" cy="7908587"/>
+            <wp:effectExtent l="0" t="0" r="1905" b="3810"/>
+            <wp:docPr id="2055881781" name="Picture 5"/>
             <wp:cNvGraphicFramePr>
               <a:graphicFrameLocks xmlns:a="http://schemas.openxmlformats.org/drawingml/2006/main" noChangeAspect="1"/>
             </wp:cNvGraphicFramePr>
@@ -235,7 +238,7 @@
               <a:graphicData uri="http://schemas.openxmlformats.org/drawingml/2006/picture">
                 <pic:pic xmlns:pic="http://schemas.openxmlformats.org/drawingml/2006/picture">
                   <pic:nvPicPr>
-                    <pic:cNvPr id="660850121" name="Picture 660850121"/>
+                    <pic:cNvPr id="2055881781" name="Picture 2055881781"/>
                     <pic:cNvPicPr/>
                   </pic:nvPicPr>
                   <pic:blipFill>
@@ -253,7 +256,7 @@
                   <pic:spPr>
                     <a:xfrm>
                       <a:off x="0" y="0"/>
-                      <a:ext cx="4519940" cy="7909589"/>
+                      <a:ext cx="4533577" cy="7933453"/>
                     </a:xfrm>
                     <a:prstGeom prst="rect">
                       <a:avLst/>
@@ -295,10 +298,10 @@
         </w:rPr>
         <w:lastRenderedPageBreak/>
         <w:drawing>
-          <wp:inline distT="0" distB="0" distL="0" distR="0" wp14:anchorId="6DCF98E0" wp14:editId="65BDD7DE">
-            <wp:extent cx="5262664" cy="7893996"/>
-            <wp:effectExtent l="0" t="0" r="0" b="5715"/>
-            <wp:docPr id="378504161" name="Picture 5"/>
+          <wp:inline distT="0" distB="0" distL="0" distR="0" wp14:anchorId="7F106D27" wp14:editId="279E0FFA">
+            <wp:extent cx="5291847" cy="7937770"/>
+            <wp:effectExtent l="0" t="0" r="4445" b="0"/>
+            <wp:docPr id="1136057783" name="Picture 6"/>
             <wp:cNvGraphicFramePr>
               <a:graphicFrameLocks xmlns:a="http://schemas.openxmlformats.org/drawingml/2006/main" noChangeAspect="1"/>
             </wp:cNvGraphicFramePr>
@@ -306,7 +309,7 @@
               <a:graphicData uri="http://schemas.openxmlformats.org/drawingml/2006/picture">
                 <pic:pic xmlns:pic="http://schemas.openxmlformats.org/drawingml/2006/picture">
                   <pic:nvPicPr>
-                    <pic:cNvPr id="378504161" name="Picture 378504161"/>
+                    <pic:cNvPr id="1136057783" name="Picture 1136057783"/>
                     <pic:cNvPicPr/>
                   </pic:nvPicPr>
                   <pic:blipFill>
@@ -324,7 +327,7 @@
                   <pic:spPr>
                     <a:xfrm>
                       <a:off x="0" y="0"/>
-                      <a:ext cx="5269531" cy="7904296"/>
+                      <a:ext cx="5330150" cy="7995224"/>
                     </a:xfrm>
                     <a:prstGeom prst="rect">
                       <a:avLst/>

</xml_diff>